<commit_message>
Updates of previously existing templates and examples after an internal consistency check. Addition of new templates and examples. Updated lookup table to account for a new artifact, and document manifest updated to reflect added templates and examples. 50 templates and examples [of the library of 163] are complete and included here.
</commit_message>
<xml_diff>
--- a/public/templates/examples/A-002-CybersecurityPrivacyPolicy-EXAMPLE-L.docx
+++ b/public/templates/examples/A-002-CybersecurityPrivacyPolicy-EXAMPLE-L.docx
@@ -1785,7 +1785,7 @@
                 <w:sz w:val="24"/>
                 <w:szCs w:val="24"/>
               </w:rPr>
-              <w:t xml:space="preserve">    HEA 1169 (2021) — Cyber Incident Reporting to IOT</w:t>
+              <w:t xml:space="preserve">    HEA 1169 (2021): Cyber Incident Reporting to IOT</w:t>
             </w:r>
           </w:p>
           <w:p>
@@ -1802,7 +1802,7 @@
                 <w:sz w:val="24"/>
                 <w:szCs w:val="24"/>
               </w:rPr>
-              <w:t xml:space="preserve">    IC 24-4.9 — Data Breach Notification</w:t>
+              <w:t xml:space="preserve">    IC 24-4.9: Data Breach Notification</w:t>
             </w:r>
           </w:p>
           <w:p>
@@ -1819,7 +1819,7 @@
                 <w:sz w:val="24"/>
                 <w:szCs w:val="24"/>
               </w:rPr>
-              <w:t xml:space="preserve">    240 IAC 5 — IDACS Security</w:t>
+              <w:t xml:space="preserve">    240 IAC 5: IDACS Security</w:t>
             </w:r>
           </w:p>
           <w:p>

</xml_diff>